<commit_message>
Hub detection for real-world exports, Ruckus ICX LAG VLANs and audits, redact multi-line PEM
</commit_message>
<xml_diff>
--- a/docs/config-anonymizer-guide.docx
+++ b/docs/config-anonymizer-guide.docx
@@ -2703,6 +2703,14 @@
     </w:p>
     <w:p>
       <w:pPr>
+        <w:pStyle w:val="ListBullet"/>
+      </w:pPr>
+      <w:r>
+        <w:t>2026-10-07 修正：設定檔中的多行 PEM 內容（私鑰、憑證，例如 FortiGate 的 set private-key／set certificate）原本只有開頭一行被處理、內文會原樣留在結果中，現在一律把內文換成 REDACTED_PEM（保留開頭與結尾行）。Aruba CX 帶版本檔頭的匯出檔也能自動判斷廠牌。</w:t>
+      </w:r>
+    </w:p>
+    <w:p>
+      <w:pPr>
         <w:pStyle w:val="Heading1"/>
       </w:pPr>
       <w:r>

</xml_diff>

<commit_message>
Netgear Smart Managed Pro switch, ASA log field extraction
</commit_message>
<xml_diff>
--- a/docs/config-anonymizer-guide.docx
+++ b/docs/config-anonymizer-guide.docx
@@ -2711,6 +2711,14 @@
     </w:p>
     <w:p>
       <w:pPr>
+        <w:pStyle w:val="ListBullet"/>
+      </w:pPr>
+      <w:r>
+        <w:t>2026-10-07 新增 Netgear Smart Managed Pro（GS7xx）：遮蔽系統名稱（檔頭與 system name 換成同一假名）、位置、帳號與密碼雜湊、SNMP community 與 v3 使用者金鑰、序號、IP 與 MAC；韌體版本號不會被當成 IP。</w:t>
+      </w:r>
+    </w:p>
+    <w:p>
+      <w:pPr>
         <w:pStyle w:val="Heading1"/>
       </w:pPr>
       <w:r>

</xml_diff>

<commit_message>
Round 17: rule negation in queries, Junos apply-groups and global policies, Check Point Management API JSON import, RANCID header detection, anonymizer fixes
</commit_message>
<xml_diff>
--- a/docs/config-anonymizer-guide.docx
+++ b/docs/config-anonymizer-guide.docx
@@ -2751,6 +2751,30 @@
     </w:p>
     <w:p>
       <w:pPr>
+        <w:pStyle w:val="ListBullet"/>
+      </w:pPr>
+      <w:r>
+        <w:t>RANCID 備份檔頭（cisco-nx／arista／juniper／paloalto）與 Arista 的 boot system flash *.swi 用於廠牌判斷。</w:t>
+      </w:r>
+    </w:p>
+    <w:p>
+      <w:pPr>
+        <w:pStyle w:val="ListBullet"/>
+      </w:pPr>
+      <w:r>
+        <w:t>Junos：set groups 名稱 … 開頭的設定行也會遮蔽金鑰；另遮蔽 secret／preauthentication-secret、pre-shared-key hexadecimal、MACsec ckn／cak。Palo Alto：IKE authentication pre-shared-key、OSPF 認證金鑰、大括號格式的 password／username。</w:t>
+      </w:r>
+    </w:p>
+    <w:p>
+      <w:pPr>
+        <w:pStyle w:val="ListBullet"/>
+      </w:pPr>
+      <w:r>
+        <w:t>殘留檢查不再把 BGP community（community-list、set／match community、Junos policy-options community 等）與 Junos 密碼政策（password minimum-length 等）當成機敏資訊示警。</w:t>
+      </w:r>
+    </w:p>
+    <w:p>
+      <w:pPr>
         <w:pStyle w:val="Heading1"/>
       </w:pPr>
       <w:r>

</xml_diff>

<commit_message>
Round 18: domain-name anonymization, Check Point API JSON anonymization, FortiGate ISDB/zone/exclude/wildcard query fixes, Palo Alto dynamic address groups, default rules, Cisco ASA two-stage ACL query, Zeek/CrowdStrike Falcon/Microsoft Defender log support
</commit_message>
<xml_diff>
--- a/docs/config-anonymizer-guide.docx
+++ b/docs/config-anonymizer-guide.docx
@@ -2775,6 +2775,22 @@
     </w:p>
     <w:p>
       <w:pPr>
+        <w:pStyle w:val="ListBullet"/>
+      </w:pPr>
+      <w:r>
+        <w:t>所有廠牌模式都會遮蔽內部網域名稱（domain-name、FQDN 位址物件、VPN 對端 fqdn、NTP 伺服器主機名稱等），以主機名稱對照替換、可由對照表還原；廠牌雲端、公用時間伺服器等公開網域保留。</w:t>
+      </w:r>
+    </w:p>
+    <w:p>
+      <w:pPr>
+        <w:pStyle w:val="ListBullet"/>
+      </w:pPr>
+      <w:r>
+        <w:t>新增 Check Point Management API JSON（show-access-rulebase 等回應）：UID 保留，自訂位址物件、規則、區段名稱與備註、閘道名稱、建立者帳號會替換，預先定義物件與服務名稱保留，去識別化後仍可交給防火牆分析。</w:t>
+      </w:r>
+    </w:p>
+    <w:p>
+      <w:pPr>
         <w:pStyle w:val="Heading1"/>
       </w:pPr>
       <w:r>

</xml_diff>

<commit_message>
log 分析新增 Windows 防火牆、Squid、AWS Network Firewall 與 Azure Firewall 紀錄；防火牆分析新增 Azure Firewall Policy 與 GCP network firewall policy
</commit_message>
<xml_diff>
--- a/docs/config-anonymizer-guide.docx
+++ b/docs/config-anonymizer-guide.docx
@@ -2799,6 +2799,14 @@
     </w:p>
     <w:p>
       <w:pPr>
+        <w:pStyle w:val="ListBullet"/>
+      </w:pPr>
+      <w:r>
+        <w:t>Azure Firewall Policy 與 GCP network firewall policy（2026-10-13）：雲端安全群組格式另可處理這兩種 JSON，遮蔽訂閱與資源 ID（含 Firewall Policy、IP 群組）、規則中的 FQDN（公開網域保留）、GCP 政策名稱與 IP；殘留檢查不再把資源 ID 路徑與標籤值片段誤判為金鑰。</w:t>
+      </w:r>
+    </w:p>
+    <w:p>
+      <w:pPr>
         <w:pStyle w:val="Heading1"/>
       </w:pPr>
       <w:r>

</xml_diff>

<commit_message>
log 分析新增 OpenVPN、strongSwan、FreeRADIUS、Kubernetes 稽核、HAProxy、Duo 紀錄與 VPN 指派位址對照；防火牆分析新增 Kubernetes NetworkPolicy 與 Oracle Cloud 安全清單／NSG
</commit_message>
<xml_diff>
--- a/docs/config-anonymizer-guide.docx
+++ b/docs/config-anonymizer-guide.docx
@@ -2807,6 +2807,14 @@
     </w:p>
     <w:p>
       <w:pPr>
+        <w:pStyle w:val="ListBullet"/>
+      </w:pPr>
+      <w:r>
+        <w:t>Kubernetes NetworkPolicy 與 Oracle Cloud 安全清單／NSG（2026-10-13）：雲端安全群組格式另可處理這兩種 JSON。NetworkPolicy 的政策名稱、namespace 與選擇 namespace 用的標籤值以同一對照替換，kubectl 留下的 last-applied-configuration 註記一律遮蔽；OCI 的名稱與 OCID 唯一碼（保留資源類型與區域）、IP、描述與標籤值遮蔽，Oracle 服務網段名稱保留。</w:t>
+      </w:r>
+    </w:p>
+    <w:p>
+      <w:pPr>
         <w:pStyle w:val="Heading1"/>
       </w:pPr>
       <w:r>

</xml_diff>

<commit_message>
First-use experience: sample demos, result bar, wrong-tool routing, config export commands, first-run guide, generator role templates, glossary
</commit_message>
<xml_diff>
--- a/docs/config-anonymizer-guide.docx
+++ b/docs/config-anonymizer-guide.docx
@@ -2823,6 +2823,14 @@
     </w:p>
     <w:p>
       <w:pPr>
+        <w:pStyle w:val="ListBullet"/>
+      </w:pPr>
+      <w:r>
+        <w:t>第一次使用（2026-10-15）：上傳區有三步驟導覽；手機寬度下廠牌選單不再超出畫面。</w:t>
+      </w:r>
+    </w:p>
+    <w:p>
+      <w:pPr>
         <w:pStyle w:val="Heading1"/>
       </w:pPr>
       <w:r>

</xml_diff>